<commit_message>
Modified intervel_tree.cpp and app.py
</commit_message>
<xml_diff>
--- a/Interval Tree.docx
+++ b/Interval Tree.docx
@@ -189,12 +189,21 @@
       <w:r>
         <w:t xml:space="preserve">Interval Tree reduces this to </w:t>
       </w:r>
-      <w:r>
-        <w:rPr>
-          <w:b/>
-          <w:bCs/>
-        </w:rPr>
-        <w:t>O(log n)</w:t>
+      <w:proofErr w:type="gramStart"/>
+      <w:r>
+        <w:rPr>
+          <w:b/>
+          <w:bCs/>
+        </w:rPr>
+        <w:t>O(</w:t>
+      </w:r>
+      <w:proofErr w:type="gramEnd"/>
+      <w:r>
+        <w:rPr>
+          <w:b/>
+          <w:bCs/>
+        </w:rPr>
+        <w:t>log n)</w:t>
       </w:r>
       <w:r>
         <w:t xml:space="preserve"> for most queries.</w:t>
@@ -217,8 +226,9 @@
           <w:sz w:val="28"/>
           <w:szCs w:val="28"/>
         </w:rPr>
-        <w:t>Interval trees are of two types</w:t>
-      </w:r>
+        <w:t xml:space="preserve">Interval trees are of two </w:t>
+      </w:r>
+      <w:proofErr w:type="gramStart"/>
       <w:r>
         <w:rPr>
           <w:b/>
@@ -226,8 +236,18 @@
           <w:sz w:val="28"/>
           <w:szCs w:val="28"/>
         </w:rPr>
+        <w:t>types</w:t>
+      </w:r>
+      <w:r>
+        <w:rPr>
+          <w:b/>
+          <w:bCs/>
+          <w:sz w:val="28"/>
+          <w:szCs w:val="28"/>
+        </w:rPr>
         <w:t xml:space="preserve"> :</w:t>
       </w:r>
+      <w:proofErr w:type="gramEnd"/>
     </w:p>
     <w:p>
       <w:pPr>
@@ -319,13 +339,21 @@
     </w:p>
     <w:p>
       <w:r>
-        <w:t>Example node:</w:t>
+        <w:t>Example node</w:t>
+      </w:r>
+      <w:proofErr w:type="gramStart"/>
+      <w:r>
+        <w:t>:</w:t>
       </w:r>
       <w:r>
         <w:t xml:space="preserve">  </w:t>
       </w:r>
       <w:r>
-        <w:t>[2,6], max = 8</w:t>
+        <w:t>[</w:t>
+      </w:r>
+      <w:proofErr w:type="gramEnd"/>
+      <w:r>
+        <w:t>2,6], max = 8</w:t>
       </w:r>
     </w:p>
     <w:p>
@@ -539,11 +567,16 @@
     <w:p/>
     <w:p>
       <w:r>
-        <w:t xml:space="preserve">Each node contains </w:t>
+        <w:t xml:space="preserve">Each node </w:t>
+      </w:r>
+      <w:proofErr w:type="gramStart"/>
+      <w:r>
+        <w:t xml:space="preserve">contains </w:t>
       </w:r>
       <w:r>
         <w:t xml:space="preserve"> :</w:t>
       </w:r>
+      <w:proofErr w:type="gramEnd"/>
     </w:p>
     <w:p>
       <w:r>
@@ -551,9 +584,14 @@
       </w:r>
     </w:p>
     <w:p>
+      <w:proofErr w:type="gramStart"/>
       <w:r>
         <w:lastRenderedPageBreak/>
-        <w:t>high  → end of interval</w:t>
+        <w:t>high  →</w:t>
+      </w:r>
+      <w:proofErr w:type="gramEnd"/>
+      <w:r>
+        <w:t xml:space="preserve"> end of interval</w:t>
       </w:r>
     </w:p>
     <w:p>
@@ -562,8 +600,13 @@
       </w:r>
     </w:p>
     <w:p>
-      <w:r>
-        <w:t>left  → left child</w:t>
+      <w:proofErr w:type="gramStart"/>
+      <w:r>
+        <w:t>left  →</w:t>
+      </w:r>
+      <w:proofErr w:type="gramEnd"/>
+      <w:r>
+        <w:t xml:space="preserve"> left child</w:t>
       </w:r>
     </w:p>
     <w:p>
@@ -929,7 +972,7 @@
               </w:rPr>
               <w:lastRenderedPageBreak/>
               <w:drawing>
-                <wp:inline distT="0" distB="0" distL="0" distR="0" wp14:anchorId="7921537E" wp14:editId="154FC695">
+                <wp:inline distT="0" distB="0" distL="0" distR="0" wp14:anchorId="7921537E" wp14:editId="1A1E048C">
                   <wp:extent cx="5616251" cy="3063240"/>
                   <wp:effectExtent l="0" t="0" r="3810" b="3810"/>
                   <wp:docPr id="135529914" name="Picture 2"/>
@@ -999,69 +1042,95 @@
         <w:t>[2,6] and [3,5] → overlap</w:t>
       </w:r>
       <w:r>
-        <w:t xml:space="preserve"> as </w:t>
-      </w:r>
-      <w:r>
         <w:t xml:space="preserve"> </w:t>
       </w:r>
-      <w:r>
-        <w:t xml:space="preserve">2 </w:t>
-      </w:r>
+      <w:proofErr w:type="gramStart"/>
+      <w:r>
+        <w:t xml:space="preserve">as </w:t>
+      </w:r>
+      <w:r>
+        <w:t xml:space="preserve"> </w:t>
+      </w:r>
+      <w:r>
+        <w:t>2</w:t>
+      </w:r>
+      <w:proofErr w:type="gramEnd"/>
+      <w:r>
+        <w:t xml:space="preserve"> </w:t>
+      </w:r>
+      <w:r>
+        <w:t xml:space="preserve"> </w:t>
+      </w:r>
+      <w:proofErr w:type="gramStart"/>
+      <w:r>
+        <w:t xml:space="preserve">≤ </w:t>
+      </w:r>
+      <w:r>
+        <w:t xml:space="preserve"> </w:t>
+      </w:r>
+      <w:r>
+        <w:t>5</w:t>
+      </w:r>
+      <w:proofErr w:type="gramEnd"/>
+      <w:r>
+        <w:t xml:space="preserve"> </w:t>
+      </w:r>
+      <w:proofErr w:type="gramStart"/>
+      <w:r>
+        <w:t>and  3</w:t>
+      </w:r>
+      <w:proofErr w:type="gramEnd"/>
       <w:r>
         <w:t xml:space="preserve"> ≤ </w:t>
       </w:r>
       <w:r>
+        <w:t>6</w:t>
+      </w:r>
+    </w:p>
+    <w:p/>
+    <w:p>
+      <w:r>
+        <w:t>Example</w:t>
+      </w:r>
+      <w:r>
+        <w:t>-2</w:t>
+      </w:r>
+      <w:r>
+        <w:t>:</w:t>
+      </w:r>
+      <w:r>
         <w:t xml:space="preserve"> </w:t>
       </w:r>
-      <w:r>
-        <w:t>5 and  3</w:t>
-      </w:r>
-      <w:r>
-        <w:t xml:space="preserve"> ≤ </w:t>
-      </w:r>
-      <w:r>
-        <w:t>6</w:t>
-      </w:r>
-    </w:p>
-    <w:p/>
-    <w:p>
-      <w:r>
-        <w:t>Example</w:t>
-      </w:r>
-      <w:r>
-        <w:t>-2</w:t>
-      </w:r>
-      <w:r>
-        <w:t>:</w:t>
+    </w:p>
+    <w:p>
+      <w:r>
+        <w:t>Query interval: [3,5]</w:t>
+      </w:r>
+    </w:p>
+    <w:p>
+      <w:r>
+        <w:t>Start at root [1,4]</w:t>
+      </w:r>
+    </w:p>
+    <w:p>
+      <w:r>
+        <w:t>Check overlap:</w:t>
       </w:r>
       <w:r>
         <w:t xml:space="preserve"> </w:t>
       </w:r>
-    </w:p>
-    <w:p>
-      <w:r>
-        <w:t>Query interval: [3,5]</w:t>
-      </w:r>
-    </w:p>
-    <w:p>
-      <w:r>
-        <w:t>Start at root [1,4]</w:t>
-      </w:r>
-    </w:p>
-    <w:p>
-      <w:r>
-        <w:t>Check overlap:</w:t>
-      </w:r>
-      <w:r>
-        <w:t xml:space="preserve"> </w:t>
-      </w:r>
       <w:r>
         <w:t>[1,4] overlaps [3,5] → YES</w:t>
       </w:r>
     </w:p>
     <w:p>
-      <w:r>
-        <w:t>So we’re done.</w:t>
+      <w:proofErr w:type="gramStart"/>
+      <w:r>
+        <w:t>So</w:t>
+      </w:r>
+      <w:proofErr w:type="gramEnd"/>
+      <w:r>
+        <w:t xml:space="preserve"> we’re done.</w:t>
       </w:r>
     </w:p>
     <w:p/>
@@ -1074,7 +1143,31 @@
         <w:t xml:space="preserve"> we did not find overlapping interval at root node, we will move to </w:t>
       </w:r>
       <w:r>
-        <w:t>next node ( either left ot right )  based on max value</w:t>
+        <w:t xml:space="preserve">next node </w:t>
+      </w:r>
+      <w:proofErr w:type="gramStart"/>
+      <w:r>
+        <w:t>( either</w:t>
+      </w:r>
+      <w:proofErr w:type="gramEnd"/>
+      <w:r>
+        <w:t xml:space="preserve"> left </w:t>
+      </w:r>
+      <w:proofErr w:type="spellStart"/>
+      <w:r>
+        <w:t>ot</w:t>
+      </w:r>
+      <w:proofErr w:type="spellEnd"/>
+      <w:r>
+        <w:t xml:space="preserve"> </w:t>
+      </w:r>
+      <w:proofErr w:type="gramStart"/>
+      <w:r>
+        <w:t>right )</w:t>
+      </w:r>
+      <w:proofErr w:type="gramEnd"/>
+      <w:r>
+        <w:t xml:space="preserve">  based on max value</w:t>
       </w:r>
     </w:p>
     <w:p/>
@@ -1085,7 +1178,15 @@
     </w:p>
     <w:p>
       <w:r>
-        <w:t>Node interval: [L1, H1] ,  Query interval: [L2, H2]</w:t>
+        <w:t>Node interval: [L1, H1</w:t>
+      </w:r>
+      <w:proofErr w:type="gramStart"/>
+      <w:r>
+        <w:t>] ,</w:t>
+      </w:r>
+      <w:proofErr w:type="gramEnd"/>
+      <w:r>
+        <w:t xml:space="preserve">  Query interval: [L2, H2]</w:t>
       </w:r>
     </w:p>
     <w:p>
@@ -1214,6 +1315,7 @@
       <w:r>
         <w:t xml:space="preserve"> exists AND </w:t>
       </w:r>
+      <w:proofErr w:type="gramStart"/>
       <w:r>
         <w:t>LEFT</w:t>
       </w:r>
@@ -1224,7 +1326,11 @@
         <w:t xml:space="preserve">MAX </w:t>
       </w:r>
       <w:r>
-        <w:t xml:space="preserve"> ≥ L2)</w:t>
+        <w:t xml:space="preserve"> ≥</w:t>
+      </w:r>
+      <w:proofErr w:type="gramEnd"/>
+      <w:r>
+        <w:t xml:space="preserve"> L2)</w:t>
       </w:r>
     </w:p>
     <w:p>
@@ -1373,8 +1479,19 @@
           <w:sz w:val="28"/>
           <w:szCs w:val="28"/>
         </w:rPr>
-        <w:t>Why this avoids O(n) ?</w:t>
-      </w:r>
+        <w:t>Why this avoids O(n</w:t>
+      </w:r>
+      <w:proofErr w:type="gramStart"/>
+      <w:r>
+        <w:rPr>
+          <w:b/>
+          <w:bCs/>
+          <w:sz w:val="28"/>
+          <w:szCs w:val="28"/>
+        </w:rPr>
+        <w:t>) ?</w:t>
+      </w:r>
+      <w:proofErr w:type="gramEnd"/>
     </w:p>
     <w:p>
       <w:r>
@@ -1440,12 +1557,21 @@
       <w:r>
         <w:t xml:space="preserve"> </w:t>
       </w:r>
-      <w:r>
-        <w:rPr>
-          <w:b/>
-          <w:bCs/>
-        </w:rPr>
-        <w:t>O(log n)</w:t>
+      <w:proofErr w:type="gramStart"/>
+      <w:r>
+        <w:rPr>
+          <w:b/>
+          <w:bCs/>
+        </w:rPr>
+        <w:t>O(</w:t>
+      </w:r>
+      <w:proofErr w:type="gramEnd"/>
+      <w:r>
+        <w:rPr>
+          <w:b/>
+          <w:bCs/>
+        </w:rPr>
+        <w:t>log n)</w:t>
       </w:r>
     </w:p>
     <w:p>
@@ -1499,14 +1625,30 @@
           <w:b/>
           <w:bCs/>
         </w:rPr>
-        <w:t xml:space="preserve">Overlap checking function </w:t>
-      </w:r>
-      <w:r>
-        <w:rPr>
-          <w:b/>
-          <w:bCs/>
-        </w:rPr>
-        <w:t xml:space="preserve">: </w:t>
+        <w:t xml:space="preserve">Overlap checking </w:t>
+      </w:r>
+      <w:proofErr w:type="gramStart"/>
+      <w:r>
+        <w:rPr>
+          <w:b/>
+          <w:bCs/>
+        </w:rPr>
+        <w:t xml:space="preserve">function </w:t>
+      </w:r>
+      <w:r>
+        <w:rPr>
+          <w:b/>
+          <w:bCs/>
+        </w:rPr>
+        <w:t>:</w:t>
+      </w:r>
+      <w:proofErr w:type="gramEnd"/>
+      <w:r>
+        <w:rPr>
+          <w:b/>
+          <w:bCs/>
+        </w:rPr>
+        <w:t xml:space="preserve"> </w:t>
       </w:r>
     </w:p>
     <w:tbl>
@@ -1528,7 +1670,15 @@
               <w:spacing w:after="160" w:line="278" w:lineRule="auto"/>
             </w:pPr>
             <w:r>
-              <w:t>FUNCTION overlap(i1, i2):</w:t>
+              <w:t xml:space="preserve">FUNCTION </w:t>
+            </w:r>
+            <w:proofErr w:type="gramStart"/>
+            <w:r>
+              <w:t>overlap(</w:t>
+            </w:r>
+            <w:proofErr w:type="gramEnd"/>
+            <w:r>
+              <w:t>i1, i2):</w:t>
             </w:r>
           </w:p>
           <w:p>
@@ -1536,7 +1686,23 @@
               <w:spacing w:after="160" w:line="278" w:lineRule="auto"/>
             </w:pPr>
             <w:r>
-              <w:t xml:space="preserve">    IF i1.low ≤ i2.high AND i2.low ≤ i1.high:</w:t>
+              <w:t xml:space="preserve">    IF i1.low ≤ i</w:t>
+            </w:r>
+            <w:proofErr w:type="gramStart"/>
+            <w:r>
+              <w:t>2.high</w:t>
+            </w:r>
+            <w:proofErr w:type="gramEnd"/>
+            <w:r>
+              <w:t xml:space="preserve"> AND i2.low ≤ i</w:t>
+            </w:r>
+            <w:proofErr w:type="gramStart"/>
+            <w:r>
+              <w:t>1.high</w:t>
+            </w:r>
+            <w:proofErr w:type="gramEnd"/>
+            <w:r>
+              <w:t>:</w:t>
             </w:r>
           </w:p>
           <w:p>
@@ -1632,7 +1798,15 @@
           </w:tcPr>
           <w:p>
             <w:r>
-              <w:t>FUNCTION insert(root, interval):</w:t>
+              <w:t xml:space="preserve">FUNCTION </w:t>
+            </w:r>
+            <w:proofErr w:type="gramStart"/>
+            <w:r>
+              <w:t>insert(</w:t>
+            </w:r>
+            <w:proofErr w:type="gramEnd"/>
+            <w:r>
+              <w:t>root, interval):</w:t>
             </w:r>
           </w:p>
           <w:p/>
@@ -1648,27 +1822,102 @@
           </w:p>
           <w:p>
             <w:r>
-              <w:t xml:space="preserve">        node.low  = interval.low</w:t>
-            </w:r>
+              <w:t xml:space="preserve">        </w:t>
+            </w:r>
+            <w:proofErr w:type="spellStart"/>
+            <w:proofErr w:type="gramStart"/>
+            <w:r>
+              <w:t>node.low</w:t>
+            </w:r>
+            <w:proofErr w:type="spellEnd"/>
+            <w:r>
+              <w:t xml:space="preserve">  =</w:t>
+            </w:r>
+            <w:proofErr w:type="gramEnd"/>
+            <w:r>
+              <w:t xml:space="preserve"> </w:t>
+            </w:r>
+            <w:proofErr w:type="spellStart"/>
+            <w:r>
+              <w:t>interval.low</w:t>
+            </w:r>
+            <w:proofErr w:type="spellEnd"/>
           </w:p>
           <w:p>
             <w:r>
-              <w:t xml:space="preserve">        node.high = interval.high</w:t>
-            </w:r>
+              <w:t xml:space="preserve">        </w:t>
+            </w:r>
+            <w:proofErr w:type="spellStart"/>
+            <w:proofErr w:type="gramStart"/>
+            <w:r>
+              <w:t>node.high</w:t>
+            </w:r>
+            <w:proofErr w:type="spellEnd"/>
+            <w:proofErr w:type="gramEnd"/>
+            <w:r>
+              <w:t xml:space="preserve"> = </w:t>
+            </w:r>
+            <w:proofErr w:type="spellStart"/>
+            <w:proofErr w:type="gramStart"/>
+            <w:r>
+              <w:t>interval.high</w:t>
+            </w:r>
+            <w:proofErr w:type="spellEnd"/>
+            <w:proofErr w:type="gramEnd"/>
           </w:p>
           <w:p>
             <w:r>
-              <w:t xml:space="preserve">        node.max  = interval.high</w:t>
-            </w:r>
+              <w:t xml:space="preserve">        </w:t>
+            </w:r>
+            <w:proofErr w:type="spellStart"/>
+            <w:proofErr w:type="gramStart"/>
+            <w:r>
+              <w:t>node.max</w:t>
+            </w:r>
+            <w:proofErr w:type="spellEnd"/>
+            <w:r>
+              <w:t xml:space="preserve">  =</w:t>
+            </w:r>
+            <w:proofErr w:type="gramEnd"/>
+            <w:r>
+              <w:t xml:space="preserve"> </w:t>
+            </w:r>
+            <w:proofErr w:type="spellStart"/>
+            <w:proofErr w:type="gramStart"/>
+            <w:r>
+              <w:t>interval.high</w:t>
+            </w:r>
+            <w:proofErr w:type="spellEnd"/>
+            <w:proofErr w:type="gramEnd"/>
           </w:p>
           <w:p>
             <w:r>
-              <w:t xml:space="preserve">        node.left = NULL</w:t>
+              <w:t xml:space="preserve">        </w:t>
+            </w:r>
+            <w:proofErr w:type="spellStart"/>
+            <w:proofErr w:type="gramStart"/>
+            <w:r>
+              <w:t>node.left</w:t>
+            </w:r>
+            <w:proofErr w:type="spellEnd"/>
+            <w:proofErr w:type="gramEnd"/>
+            <w:r>
+              <w:t xml:space="preserve"> = NULL</w:t>
             </w:r>
           </w:p>
           <w:p>
             <w:r>
-              <w:t xml:space="preserve">        node.right = NULL</w:t>
+              <w:t xml:space="preserve">        </w:t>
+            </w:r>
+            <w:proofErr w:type="spellStart"/>
+            <w:proofErr w:type="gramStart"/>
+            <w:r>
+              <w:t>node.right</w:t>
+            </w:r>
+            <w:proofErr w:type="spellEnd"/>
+            <w:proofErr w:type="gramEnd"/>
+            <w:r>
+              <w:t xml:space="preserve"> = NULL</w:t>
             </w:r>
           </w:p>
           <w:p>
@@ -1679,12 +1928,51 @@
           <w:p/>
           <w:p>
             <w:r>
-              <w:t xml:space="preserve">    IF interval.low &lt; root.low:</w:t>
+              <w:t xml:space="preserve">    IF </w:t>
+            </w:r>
+            <w:proofErr w:type="spellStart"/>
+            <w:r>
+              <w:t>interval.low</w:t>
+            </w:r>
+            <w:proofErr w:type="spellEnd"/>
+            <w:r>
+              <w:t xml:space="preserve"> &lt; </w:t>
+            </w:r>
+            <w:proofErr w:type="spellStart"/>
+            <w:r>
+              <w:t>root.low</w:t>
+            </w:r>
+            <w:proofErr w:type="spellEnd"/>
+            <w:r>
+              <w:t>:</w:t>
             </w:r>
           </w:p>
           <w:p>
             <w:r>
-              <w:t xml:space="preserve">        root.left = insert(root.left, interval)</w:t>
+              <w:t xml:space="preserve">        </w:t>
+            </w:r>
+            <w:proofErr w:type="spellStart"/>
+            <w:proofErr w:type="gramStart"/>
+            <w:r>
+              <w:t>root.left</w:t>
+            </w:r>
+            <w:proofErr w:type="spellEnd"/>
+            <w:proofErr w:type="gramEnd"/>
+            <w:r>
+              <w:t xml:space="preserve"> = </w:t>
+            </w:r>
+            <w:proofErr w:type="gramStart"/>
+            <w:r>
+              <w:t>insert(</w:t>
+            </w:r>
+            <w:proofErr w:type="spellStart"/>
+            <w:r>
+              <w:t>root.left</w:t>
+            </w:r>
+            <w:proofErr w:type="spellEnd"/>
+            <w:proofErr w:type="gramEnd"/>
+            <w:r>
+              <w:t>, interval)</w:t>
             </w:r>
           </w:p>
           <w:p>
@@ -1694,7 +1982,30 @@
           </w:p>
           <w:p>
             <w:r>
-              <w:t xml:space="preserve">        root.right = insert(root.right, interval)</w:t>
+              <w:t xml:space="preserve">        </w:t>
+            </w:r>
+            <w:proofErr w:type="spellStart"/>
+            <w:proofErr w:type="gramStart"/>
+            <w:r>
+              <w:t>root.right</w:t>
+            </w:r>
+            <w:proofErr w:type="spellEnd"/>
+            <w:proofErr w:type="gramEnd"/>
+            <w:r>
+              <w:t xml:space="preserve"> = </w:t>
+            </w:r>
+            <w:proofErr w:type="gramStart"/>
+            <w:r>
+              <w:t>insert(</w:t>
+            </w:r>
+            <w:proofErr w:type="spellStart"/>
+            <w:r>
+              <w:t>root.right</w:t>
+            </w:r>
+            <w:proofErr w:type="spellEnd"/>
+            <w:proofErr w:type="gramEnd"/>
+            <w:r>
+              <w:t>, interval)</w:t>
             </w:r>
           </w:p>
           <w:p/>
@@ -1705,7 +2016,38 @@
           </w:p>
           <w:p>
             <w:r>
-              <w:t xml:space="preserve">    root.max = MAX(root.max, interval.high)</w:t>
+              <w:t xml:space="preserve">    </w:t>
+            </w:r>
+            <w:proofErr w:type="spellStart"/>
+            <w:r>
+              <w:t>root.max</w:t>
+            </w:r>
+            <w:proofErr w:type="spellEnd"/>
+            <w:r>
+              <w:t xml:space="preserve"> = </w:t>
+            </w:r>
+            <w:proofErr w:type="gramStart"/>
+            <w:r>
+              <w:t>MAX(</w:t>
+            </w:r>
+            <w:proofErr w:type="spellStart"/>
+            <w:proofErr w:type="gramEnd"/>
+            <w:r>
+              <w:t>root.max</w:t>
+            </w:r>
+            <w:proofErr w:type="spellEnd"/>
+            <w:r>
+              <w:t xml:space="preserve">, </w:t>
+            </w:r>
+            <w:proofErr w:type="spellStart"/>
+            <w:proofErr w:type="gramStart"/>
+            <w:r>
+              <w:t>interval.high</w:t>
+            </w:r>
+            <w:proofErr w:type="spellEnd"/>
+            <w:proofErr w:type="gramEnd"/>
+            <w:r>
+              <w:t>)</w:t>
             </w:r>
           </w:p>
           <w:p/>
@@ -1773,8 +2115,13 @@
               <w:t>Left subtree:</w:t>
             </w:r>
             <w:r>
-              <w:t xml:space="preserve"> intervals with low &lt; root.low</w:t>
-            </w:r>
+              <w:t xml:space="preserve"> intervals with low &lt; </w:t>
+            </w:r>
+            <w:proofErr w:type="spellStart"/>
+            <w:r>
+              <w:t>root.low</w:t>
+            </w:r>
+            <w:proofErr w:type="spellEnd"/>
           </w:p>
           <w:p>
             <w:pPr>
@@ -1792,12 +2139,73 @@
               <w:t>Right subtree:</w:t>
             </w:r>
             <w:r>
-              <w:t xml:space="preserve"> intervals with low ≥ root.low</w:t>
-            </w:r>
+              <w:t xml:space="preserve"> intervals with low ≥ </w:t>
+            </w:r>
+            <w:proofErr w:type="spellStart"/>
+            <w:r>
+              <w:t>root.low</w:t>
+            </w:r>
+            <w:proofErr w:type="spellEnd"/>
           </w:p>
           <w:p>
             <w:r>
               <w:t>We don’t compare high for placement — that’s why max exists separately.</w:t>
+            </w:r>
+          </w:p>
+          <w:p/>
+          <w:p>
+            <w:r>
+              <w:rPr>
+                <w:noProof/>
+              </w:rPr>
+              <w:drawing>
+                <wp:inline distT="0" distB="0" distL="0" distR="0" wp14:anchorId="0BCC1682" wp14:editId="61DA989F">
+                  <wp:extent cx="5516880" cy="3673023"/>
+                  <wp:effectExtent l="0" t="0" r="7620" b="3810"/>
+                  <wp:docPr id="1855892059" name="Picture 1"/>
+                  <wp:cNvGraphicFramePr>
+                    <a:graphicFrameLocks xmlns:a="http://schemas.openxmlformats.org/drawingml/2006/main" noChangeAspect="1"/>
+                  </wp:cNvGraphicFramePr>
+                  <a:graphic xmlns:a="http://schemas.openxmlformats.org/drawingml/2006/main">
+                    <a:graphicData uri="http://schemas.openxmlformats.org/drawingml/2006/picture">
+                      <pic:pic xmlns:pic="http://schemas.openxmlformats.org/drawingml/2006/picture">
+                        <pic:nvPicPr>
+                          <pic:cNvPr id="0" name="Picture 1"/>
+                          <pic:cNvPicPr>
+                            <a:picLocks noChangeAspect="1" noChangeArrowheads="1"/>
+                          </pic:cNvPicPr>
+                        </pic:nvPicPr>
+                        <pic:blipFill>
+                          <a:blip r:embed="rId9" cstate="print">
+                            <a:extLst>
+                              <a:ext uri="{28A0092B-C50C-407E-A947-70E740481C1C}">
+                                <a14:useLocalDpi xmlns:a14="http://schemas.microsoft.com/office/drawing/2010/main" val="0"/>
+                              </a:ext>
+                            </a:extLst>
+                          </a:blip>
+                          <a:srcRect/>
+                          <a:stretch>
+                            <a:fillRect/>
+                          </a:stretch>
+                        </pic:blipFill>
+                        <pic:spPr bwMode="auto">
+                          <a:xfrm>
+                            <a:off x="0" y="0"/>
+                            <a:ext cx="5534378" cy="3684673"/>
+                          </a:xfrm>
+                          <a:prstGeom prst="rect">
+                            <a:avLst/>
+                          </a:prstGeom>
+                          <a:noFill/>
+                          <a:ln>
+                            <a:noFill/>
+                          </a:ln>
+                        </pic:spPr>
+                      </pic:pic>
+                    </a:graphicData>
+                  </a:graphic>
+                </wp:inline>
+              </w:drawing>
             </w:r>
           </w:p>
           <w:p/>
@@ -1848,7 +2256,20 @@
           </w:tcPr>
           <w:p>
             <w:r>
-              <w:t>FUNCTION searchOverlap(root, query):</w:t>
+              <w:t xml:space="preserve">FUNCTION </w:t>
+            </w:r>
+            <w:proofErr w:type="spellStart"/>
+            <w:proofErr w:type="gramStart"/>
+            <w:r>
+              <w:t>searchOverlap</w:t>
+            </w:r>
+            <w:proofErr w:type="spellEnd"/>
+            <w:r>
+              <w:t>(</w:t>
+            </w:r>
+            <w:proofErr w:type="gramEnd"/>
+            <w:r>
+              <w:t>root, query):</w:t>
             </w:r>
           </w:p>
           <w:p/>
@@ -1870,13 +2291,33 @@
           </w:p>
           <w:p>
             <w:r>
-              <w:t xml:space="preserve">    IF overlap(root.interval, query):</w:t>
+              <w:t xml:space="preserve">    IF </w:t>
+            </w:r>
+            <w:proofErr w:type="gramStart"/>
+            <w:r>
+              <w:t>overlap(</w:t>
+            </w:r>
+            <w:proofErr w:type="spellStart"/>
+            <w:r>
+              <w:t>root.interval</w:t>
+            </w:r>
+            <w:proofErr w:type="spellEnd"/>
+            <w:proofErr w:type="gramEnd"/>
+            <w:r>
+              <w:t>, query):</w:t>
             </w:r>
           </w:p>
           <w:p>
             <w:r>
-              <w:t xml:space="preserve">        RETURN root.interval</w:t>
-            </w:r>
+              <w:t xml:space="preserve">        RETURN </w:t>
+            </w:r>
+            <w:proofErr w:type="spellStart"/>
+            <w:proofErr w:type="gramStart"/>
+            <w:r>
+              <w:t>root.interval</w:t>
+            </w:r>
+            <w:proofErr w:type="spellEnd"/>
+            <w:proofErr w:type="gramEnd"/>
           </w:p>
           <w:p/>
           <w:p>
@@ -1886,12 +2327,59 @@
           </w:p>
           <w:p>
             <w:r>
-              <w:t xml:space="preserve">    IF root.left != NULL AND root.left.max ≥ query.low:</w:t>
+              <w:t xml:space="preserve">    IF </w:t>
+            </w:r>
+            <w:proofErr w:type="spellStart"/>
+            <w:proofErr w:type="gramStart"/>
+            <w:r>
+              <w:t>root.left</w:t>
+            </w:r>
+            <w:proofErr w:type="spellEnd"/>
+            <w:r>
+              <w:t xml:space="preserve"> !=</w:t>
+            </w:r>
+            <w:proofErr w:type="gramEnd"/>
+            <w:r>
+              <w:t xml:space="preserve"> NULL AND </w:t>
+            </w:r>
+            <w:proofErr w:type="spellStart"/>
+            <w:r>
+              <w:t>root.left.max</w:t>
+            </w:r>
+            <w:proofErr w:type="spellEnd"/>
+            <w:r>
+              <w:t xml:space="preserve"> ≥ </w:t>
+            </w:r>
+            <w:proofErr w:type="spellStart"/>
+            <w:r>
+              <w:t>query.low</w:t>
+            </w:r>
+            <w:proofErr w:type="spellEnd"/>
+            <w:r>
+              <w:t>:</w:t>
             </w:r>
           </w:p>
           <w:p>
             <w:r>
-              <w:t xml:space="preserve">        RETURN searchOverlap(root.left, query)</w:t>
+              <w:t xml:space="preserve">        RETURN </w:t>
+            </w:r>
+            <w:proofErr w:type="spellStart"/>
+            <w:proofErr w:type="gramStart"/>
+            <w:r>
+              <w:t>searchOverlap</w:t>
+            </w:r>
+            <w:proofErr w:type="spellEnd"/>
+            <w:r>
+              <w:t>(</w:t>
+            </w:r>
+            <w:proofErr w:type="spellStart"/>
+            <w:r>
+              <w:t>root.left</w:t>
+            </w:r>
+            <w:proofErr w:type="spellEnd"/>
+            <w:proofErr w:type="gramEnd"/>
+            <w:r>
+              <w:t>, query)</w:t>
             </w:r>
           </w:p>
           <w:p/>
@@ -1902,7 +2390,25 @@
           </w:p>
           <w:p>
             <w:r>
-              <w:t xml:space="preserve">        RETURN searchOverlap(root.right, query)</w:t>
+              <w:t xml:space="preserve">        RETURN </w:t>
+            </w:r>
+            <w:proofErr w:type="spellStart"/>
+            <w:proofErr w:type="gramStart"/>
+            <w:r>
+              <w:t>searchOverlap</w:t>
+            </w:r>
+            <w:proofErr w:type="spellEnd"/>
+            <w:r>
+              <w:t>(</w:t>
+            </w:r>
+            <w:proofErr w:type="spellStart"/>
+            <w:r>
+              <w:t>root.right</w:t>
+            </w:r>
+            <w:proofErr w:type="spellEnd"/>
+            <w:proofErr w:type="gramEnd"/>
+            <w:r>
+              <w:t>, query)</w:t>
             </w:r>
           </w:p>
           <w:p/>
@@ -4773,7 +5279,6 @@
   <w:style w:type="character" w:default="1" w:styleId="DefaultParagraphFont">
     <w:name w:val="Default Paragraph Font"/>
     <w:uiPriority w:val="1"/>
-    <w:semiHidden/>
     <w:unhideWhenUsed/>
   </w:style>
   <w:style w:type="table" w:default="1" w:styleId="TableNormal">

</xml_diff>